<commit_message>
Day 16: deepen Materi to the plan's Wissen (rule 2.17) with real findings
All 13 Wissen topics are now full: the prototyping ladder in practice, the Simulator Sickness and
Presence questionnaires, stage-gate and GOV.UK phases, the four dimensions of responsible
innovation, EU AI Act Articles 5 and 50, and the Google Glass path as a real case. Day 16 added
to verify:depth; Word documents of Day 16 rebuilt.

Co-Authored-By: Claude Sonnet 5.5 <noreply@anthropic.com>
</commit_message>
<xml_diff>
--- a/docx/Day16-Materi-AION-UX-Developer-Immersive-prototyping-and-testing-future-strategies-and-ethical.docx
+++ b/docx/Day16-Materi-AION-UX-Developer-Immersive-prototyping-and-testing-future-strategies-and-ethical.docx
@@ -2885,6 +2885,319 @@
         <w:spacing w:before="0" w:after="80"/>
       </w:pPr>
     </w:p>
+    <w:p>
+      <w:pPr>
+        <w:spacing w:before="0" w:after="100"/>
+      </w:pPr>
+      <w:r>
+        <w:rPr>
+          <w:b/>
+        </w:rPr>
+        <w:t>The ladder in real practice</w:t>
+      </w:r>
+    </w:p>
+    <w:tbl>
+      <w:tblPr>
+        <w:tblW w:w="9638" w:type="dxa"/>
+        <w:tblBorders>
+          <w:top w:val="single" w:sz="4" w:space="0" w:color="D5DEE9"/>
+          <w:left w:val="single" w:sz="4" w:space="0" w:color="D5DEE9"/>
+          <w:bottom w:val="single" w:sz="4" w:space="0" w:color="D5DEE9"/>
+          <w:right w:val="single" w:sz="4" w:space="0" w:color="D5DEE9"/>
+          <w:insideH w:val="single" w:sz="4" w:space="0" w:color="D5DEE9"/>
+          <w:insideV w:val="single" w:sz="4" w:space="0" w:color="D5DEE9"/>
+        </w:tblBorders>
+        <w:tblLayout w:type="fixed"/>
+        <w:tblCellMar>
+          <w:top w:w="60" w:type="dxa"/>
+          <w:left w:w="100" w:type="dxa"/>
+          <w:bottom w:w="60" w:type="dxa"/>
+          <w:right w:w="100" w:type="dxa"/>
+        </w:tblCellMar>
+      </w:tblPr>
+      <w:tblGrid>
+        <w:gridCol w:w="1790"/>
+        <w:gridCol w:w="5083"/>
+        <w:gridCol w:w="2765"/>
+      </w:tblGrid>
+      <w:tr>
+        <w:trPr>
+          <w:cantSplit/>
+          <w:tblHeader/>
+        </w:trPr>
+        <w:tc>
+          <w:tcPr>
+            <w:tcW w:type="dxa" w:w="1790"/>
+            <w:shd w:val="clear" w:color="auto" w:fill="E6ECF4"/>
+          </w:tcPr>
+          <w:p>
+            <w:pPr>
+              <w:spacing w:before="0" w:after="0"/>
+            </w:pPr>
+            <w:r>
+              <w:rPr>
+                <w:b/>
+                <w:sz w:val="20"/>
+              </w:rPr>
+              <w:t>Rung or tool</w:t>
+            </w:r>
+          </w:p>
+        </w:tc>
+        <w:tc>
+          <w:tcPr>
+            <w:tcW w:type="dxa" w:w="5083"/>
+            <w:shd w:val="clear" w:color="auto" w:fill="E6ECF4"/>
+          </w:tcPr>
+          <w:p>
+            <w:pPr>
+              <w:spacing w:before="0" w:after="0"/>
+            </w:pPr>
+            <w:r>
+              <w:rPr>
+                <w:b/>
+                <w:sz w:val="20"/>
+              </w:rPr>
+              <w:t>Real source or example</w:t>
+            </w:r>
+          </w:p>
+        </w:tc>
+        <w:tc>
+          <w:tcPr>
+            <w:tcW w:type="dxa" w:w="2765"/>
+            <w:shd w:val="clear" w:color="auto" w:fill="E6ECF4"/>
+          </w:tcPr>
+          <w:p>
+            <w:pPr>
+              <w:spacing w:before="0" w:after="0"/>
+            </w:pPr>
+            <w:r>
+              <w:rPr>
+                <w:b/>
+                <w:sz w:val="20"/>
+              </w:rPr>
+              <w:t>What it means for a decision</w:t>
+            </w:r>
+          </w:p>
+        </w:tc>
+      </w:tr>
+      <w:tr>
+        <w:trPr>
+          <w:cantSplit/>
+        </w:trPr>
+        <w:tc>
+          <w:tcPr>
+            <w:tcW w:type="dxa" w:w="1790"/>
+          </w:tcPr>
+          <w:p>
+            <w:pPr>
+              <w:spacing w:before="0" w:after="0"/>
+            </w:pPr>
+            <w:r>
+              <w:rPr>
+                <w:sz w:val="20"/>
+              </w:rPr>
+              <w:t>What a prototype answers</w:t>
+            </w:r>
+          </w:p>
+        </w:tc>
+        <w:tc>
+          <w:tcPr>
+            <w:tcW w:type="dxa" w:w="5083"/>
+          </w:tcPr>
+          <w:p>
+            <w:pPr>
+              <w:spacing w:before="0" w:after="0"/>
+            </w:pPr>
+            <w:r>
+              <w:rPr>
+                <w:sz w:val="20"/>
+              </w:rPr>
+              <w:t>A prototype can answer questions about the role of a product, its look and feel, and its implementation (Houde and Hill 1997).</w:t>
+            </w:r>
+          </w:p>
+        </w:tc>
+        <w:tc>
+          <w:tcPr>
+            <w:tcW w:type="dxa" w:w="2765"/>
+          </w:tcPr>
+          <w:p>
+            <w:pPr>
+              <w:spacing w:before="0" w:after="0"/>
+            </w:pPr>
+            <w:r>
+              <w:rPr>
+                <w:sz w:val="20"/>
+              </w:rPr>
+              <w:t>Say which question each rung answers, and do not read more into it.</w:t>
+            </w:r>
+          </w:p>
+        </w:tc>
+      </w:tr>
+      <w:tr>
+        <w:trPr>
+          <w:cantSplit/>
+        </w:trPr>
+        <w:tc>
+          <w:tcPr>
+            <w:tcW w:type="dxa" w:w="1790"/>
+          </w:tcPr>
+          <w:p>
+            <w:pPr>
+              <w:spacing w:before="0" w:after="0"/>
+            </w:pPr>
+            <w:r>
+              <w:rPr>
+                <w:sz w:val="20"/>
+              </w:rPr>
+              <w:t>Experience prototyping</w:t>
+            </w:r>
+          </w:p>
+        </w:tc>
+        <w:tc>
+          <w:tcPr>
+            <w:tcW w:type="dxa" w:w="5083"/>
+          </w:tcPr>
+          <w:p>
+            <w:pPr>
+              <w:spacing w:before="0" w:after="0"/>
+            </w:pPr>
+            <w:r>
+              <w:rPr>
+                <w:sz w:val="20"/>
+              </w:rPr>
+              <w:t>Experience prototypes let people live through a situation rather than only look at a design (Buchenau and Fulton Suri 2000).</w:t>
+            </w:r>
+          </w:p>
+        </w:tc>
+        <w:tc>
+          <w:tcPr>
+            <w:tcW w:type="dxa" w:w="2765"/>
+          </w:tcPr>
+          <w:p>
+            <w:pPr>
+              <w:spacing w:before="0" w:after="0"/>
+            </w:pPr>
+            <w:r>
+              <w:rPr>
+                <w:sz w:val="20"/>
+              </w:rPr>
+              <w:t>For immersive systems test the experience in the place of use, not a screenshot.</w:t>
+            </w:r>
+          </w:p>
+        </w:tc>
+      </w:tr>
+      <w:tr>
+        <w:trPr>
+          <w:cantSplit/>
+        </w:trPr>
+        <w:tc>
+          <w:tcPr>
+            <w:tcW w:type="dxa" w:w="1790"/>
+          </w:tcPr>
+          <w:p>
+            <w:pPr>
+              <w:spacing w:before="0" w:after="0"/>
+            </w:pPr>
+            <w:r>
+              <w:rPr>
+                <w:sz w:val="20"/>
+              </w:rPr>
+              <w:t>Gates</w:t>
+            </w:r>
+          </w:p>
+        </w:tc>
+        <w:tc>
+          <w:tcPr>
+            <w:tcW w:type="dxa" w:w="5083"/>
+          </w:tcPr>
+          <w:p>
+            <w:pPr>
+              <w:spacing w:before="0" w:after="0"/>
+            </w:pPr>
+            <w:r>
+              <w:rPr>
+                <w:sz w:val="20"/>
+              </w:rPr>
+              <w:t>A stage-gate system separates stages by gates where a project must meet criteria to continue, change or stop (Cooper 1990). UK government services pass discovery, alpha, beta and live, each with an assessment (GOV.UK Service Standard).</w:t>
+            </w:r>
+          </w:p>
+        </w:tc>
+        <w:tc>
+          <w:tcPr>
+            <w:tcW w:type="dxa" w:w="2765"/>
+          </w:tcPr>
+          <w:p>
+            <w:pPr>
+              <w:spacing w:before="0" w:after="0"/>
+            </w:pPr>
+            <w:r>
+              <w:rPr>
+                <w:sz w:val="20"/>
+              </w:rPr>
+              <w:t>Write the gate criteria before the pilot starts.</w:t>
+            </w:r>
+          </w:p>
+        </w:tc>
+      </w:tr>
+      <w:tr>
+        <w:trPr>
+          <w:cantSplit/>
+        </w:trPr>
+        <w:tc>
+          <w:tcPr>
+            <w:tcW w:type="dxa" w:w="1790"/>
+          </w:tcPr>
+          <w:p>
+            <w:pPr>
+              <w:spacing w:before="0" w:after="0"/>
+            </w:pPr>
+            <w:r>
+              <w:rPr>
+                <w:sz w:val="20"/>
+              </w:rPr>
+              <w:t>A real case on the ladder</w:t>
+            </w:r>
+          </w:p>
+        </w:tc>
+        <w:tc>
+          <w:tcPr>
+            <w:tcW w:type="dxa" w:w="5083"/>
+          </w:tcPr>
+          <w:p>
+            <w:pPr>
+              <w:spacing w:before="0" w:after="0"/>
+            </w:pPr>
+            <w:r>
+              <w:rPr>
+                <w:sz w:val="20"/>
+              </w:rPr>
+              <w:t>Google ran an Explorer programme for Glass from 2013, ended the sale of the consumer version in January 2015, sold an enterprise edition from 2017 and stopped selling it in March 2023 (press reports, as reported).</w:t>
+            </w:r>
+          </w:p>
+        </w:tc>
+        <w:tc>
+          <w:tcPr>
+            <w:tcW w:type="dxa" w:w="2765"/>
+          </w:tcPr>
+          <w:p>
+            <w:pPr>
+              <w:spacing w:before="0" w:after="0"/>
+            </w:pPr>
+            <w:r>
+              <w:rPr>
+                <w:sz w:val="20"/>
+              </w:rPr>
+              <w:t>A product can leave a rung or step back to another: the ladder is not a one-way road.</w:t>
+            </w:r>
+          </w:p>
+        </w:tc>
+      </w:tr>
+    </w:tbl>
+    <w:p>
+      <w:pPr>
+        <w:spacing w:before="0" w:after="80"/>
+      </w:pPr>
+    </w:p>
     <w:tbl>
       <w:tblPr>
         <w:tblW w:w="9598" w:type="dxa"/>
@@ -2934,7 +3247,7 @@
             </w:pPr>
             <w:r>
               <w:rPr/>
-              <w:t>Fernwood, Leila, Sam, Rafael and Greta are made up for this example; the corridor and the reports are drawn for the lesson. What prototypes prototype follows Houde and Hill (1997) and Buchenau and Fulton Suri (2000); gates between stages follow Cooper (1990).</w:t>
+              <w:t>Fernwood, Leila, Sam, Rafael and Greta are made up for this example; the corridor and the reports are drawn for the lesson. What prototypes prototype follows Houde and Hill (1997) and Buchenau and Fulton Suri (2000); gates between stages follow Cooper (1990). The findings in the table of real evidence are real research results, rules and cases; the sources are listed below.</w:t>
             </w:r>
           </w:p>
         </w:tc>
@@ -3123,7 +3436,7 @@
           <w:color w:val="556274"/>
           <w:sz w:val="18"/>
         </w:rPr>
-        <w:t>Houde &amp; Hill 1997 · Buchenau &amp; Fulton Suri 2000 · Cooper 1990</w:t>
+        <w:t>Houde &amp; Hill 1997 · Buchenau &amp; Fulton Suri 2000 · Cooper 1990 · GOV.UK Service Standard</w:t>
       </w:r>
     </w:p>
     <w:p>
@@ -3722,6 +4035,372 @@
         <w:spacing w:before="0" w:after="80"/>
       </w:pPr>
     </w:p>
+    <w:p>
+      <w:pPr>
+        <w:spacing w:before="0" w:after="100"/>
+      </w:pPr>
+      <w:r>
+        <w:rPr>
+          <w:b/>
+        </w:rPr>
+        <w:t>Testing immersive systems: instruments and rules</w:t>
+      </w:r>
+    </w:p>
+    <w:tbl>
+      <w:tblPr>
+        <w:tblW w:w="9638" w:type="dxa"/>
+        <w:tblBorders>
+          <w:top w:val="single" w:sz="4" w:space="0" w:color="D5DEE9"/>
+          <w:left w:val="single" w:sz="4" w:space="0" w:color="D5DEE9"/>
+          <w:bottom w:val="single" w:sz="4" w:space="0" w:color="D5DEE9"/>
+          <w:right w:val="single" w:sz="4" w:space="0" w:color="D5DEE9"/>
+          <w:insideH w:val="single" w:sz="4" w:space="0" w:color="D5DEE9"/>
+          <w:insideV w:val="single" w:sz="4" w:space="0" w:color="D5DEE9"/>
+        </w:tblBorders>
+        <w:tblLayout w:type="fixed"/>
+        <w:tblCellMar>
+          <w:top w:w="60" w:type="dxa"/>
+          <w:left w:w="100" w:type="dxa"/>
+          <w:bottom w:w="60" w:type="dxa"/>
+          <w:right w:w="100" w:type="dxa"/>
+        </w:tblCellMar>
+      </w:tblPr>
+      <w:tblGrid>
+        <w:gridCol w:w="1430"/>
+        <w:gridCol w:w="5184"/>
+        <w:gridCol w:w="3024"/>
+      </w:tblGrid>
+      <w:tr>
+        <w:trPr>
+          <w:cantSplit/>
+          <w:tblHeader/>
+        </w:trPr>
+        <w:tc>
+          <w:tcPr>
+            <w:tcW w:type="dxa" w:w="1430"/>
+            <w:shd w:val="clear" w:color="auto" w:fill="E6ECF4"/>
+          </w:tcPr>
+          <w:p>
+            <w:pPr>
+              <w:spacing w:before="0" w:after="0"/>
+            </w:pPr>
+            <w:r>
+              <w:rPr>
+                <w:b/>
+                <w:sz w:val="20"/>
+              </w:rPr>
+              <w:t>Aspect</w:t>
+            </w:r>
+          </w:p>
+        </w:tc>
+        <w:tc>
+          <w:tcPr>
+            <w:tcW w:type="dxa" w:w="5184"/>
+            <w:shd w:val="clear" w:color="auto" w:fill="E6ECF4"/>
+          </w:tcPr>
+          <w:p>
+            <w:pPr>
+              <w:spacing w:before="0" w:after="0"/>
+            </w:pPr>
+            <w:r>
+              <w:rPr>
+                <w:b/>
+                <w:sz w:val="20"/>
+              </w:rPr>
+              <w:t>Real instrument or rule</w:t>
+            </w:r>
+          </w:p>
+        </w:tc>
+        <w:tc>
+          <w:tcPr>
+            <w:tcW w:type="dxa" w:w="3024"/>
+            <w:shd w:val="clear" w:color="auto" w:fill="E6ECF4"/>
+          </w:tcPr>
+          <w:p>
+            <w:pPr>
+              <w:spacing w:before="0" w:after="0"/>
+            </w:pPr>
+            <w:r>
+              <w:rPr>
+                <w:b/>
+                <w:sz w:val="20"/>
+              </w:rPr>
+              <w:t>What it means for a test</w:t>
+            </w:r>
+          </w:p>
+        </w:tc>
+      </w:tr>
+      <w:tr>
+        <w:trPr>
+          <w:cantSplit/>
+        </w:trPr>
+        <w:tc>
+          <w:tcPr>
+            <w:tcW w:type="dxa" w:w="1430"/>
+          </w:tcPr>
+          <w:p>
+            <w:pPr>
+              <w:spacing w:before="0" w:after="0"/>
+            </w:pPr>
+            <w:r>
+              <w:rPr>
+                <w:sz w:val="20"/>
+              </w:rPr>
+              <w:t>Overload and sickness</w:t>
+            </w:r>
+          </w:p>
+        </w:tc>
+        <w:tc>
+          <w:tcPr>
+            <w:tcW w:type="dxa" w:w="5184"/>
+          </w:tcPr>
+          <w:p>
+            <w:pPr>
+              <w:spacing w:before="0" w:after="0"/>
+            </w:pPr>
+            <w:r>
+              <w:rPr>
+                <w:sz w:val="20"/>
+              </w:rPr>
+              <w:t>The Simulator Sickness Questionnaire asks about 16 symptoms on a four-step scale and scores nausea, oculomotor strain and disorientation (Kennedy et al. 1993).</w:t>
+            </w:r>
+          </w:p>
+        </w:tc>
+        <w:tc>
+          <w:tcPr>
+            <w:tcW w:type="dxa" w:w="3024"/>
+          </w:tcPr>
+          <w:p>
+            <w:pPr>
+              <w:spacing w:before="0" w:after="0"/>
+            </w:pPr>
+            <w:r>
+              <w:rPr>
+                <w:sz w:val="20"/>
+              </w:rPr>
+              <w:t>Use a standard instrument before and after a session, not an ad hoc question.</w:t>
+            </w:r>
+          </w:p>
+        </w:tc>
+      </w:tr>
+      <w:tr>
+        <w:trPr>
+          <w:cantSplit/>
+        </w:trPr>
+        <w:tc>
+          <w:tcPr>
+            <w:tcW w:type="dxa" w:w="1430"/>
+          </w:tcPr>
+          <w:p>
+            <w:pPr>
+              <w:spacing w:before="0" w:after="0"/>
+            </w:pPr>
+            <w:r>
+              <w:rPr>
+                <w:sz w:val="20"/>
+              </w:rPr>
+              <w:t>Presence</w:t>
+            </w:r>
+          </w:p>
+        </w:tc>
+        <w:tc>
+          <w:tcPr>
+            <w:tcW w:type="dxa" w:w="5184"/>
+          </w:tcPr>
+          <w:p>
+            <w:pPr>
+              <w:spacing w:before="0" w:after="0"/>
+            </w:pPr>
+            <w:r>
+              <w:rPr>
+                <w:sz w:val="20"/>
+              </w:rPr>
+              <w:t>The Presence Questionnaire gives a structured way to ask how present people felt (Witmer and Singer 1998).</w:t>
+            </w:r>
+          </w:p>
+        </w:tc>
+        <w:tc>
+          <w:tcPr>
+            <w:tcW w:type="dxa" w:w="3024"/>
+          </w:tcPr>
+          <w:p>
+            <w:pPr>
+              <w:spacing w:before="0" w:after="0"/>
+            </w:pPr>
+            <w:r>
+              <w:rPr>
+                <w:sz w:val="20"/>
+              </w:rPr>
+              <w:t>Ask after the session, and relate it to the task, not only to the feeling.</w:t>
+            </w:r>
+          </w:p>
+        </w:tc>
+      </w:tr>
+      <w:tr>
+        <w:trPr>
+          <w:cantSplit/>
+        </w:trPr>
+        <w:tc>
+          <w:tcPr>
+            <w:tcW w:type="dxa" w:w="1430"/>
+          </w:tcPr>
+          <w:p>
+            <w:pPr>
+              <w:spacing w:before="0" w:after="0"/>
+            </w:pPr>
+            <w:r>
+              <w:rPr>
+                <w:sz w:val="20"/>
+              </w:rPr>
+              <w:t>Comfort on a platform</w:t>
+            </w:r>
+          </w:p>
+        </w:tc>
+        <w:tc>
+          <w:tcPr>
+            <w:tcW w:type="dxa" w:w="5184"/>
+          </w:tcPr>
+          <w:p>
+            <w:pPr>
+              <w:spacing w:before="0" w:after="0"/>
+            </w:pPr>
+            <w:r>
+              <w:rPr>
+                <w:sz w:val="20"/>
+              </w:rPr>
+              <w:t>Meta's store policies ask apps to rate their comfort on one scale and to show content ratings and warnings before release (Meta Horizon Store policies).</w:t>
+            </w:r>
+          </w:p>
+        </w:tc>
+        <w:tc>
+          <w:tcPr>
+            <w:tcW w:type="dxa" w:w="3024"/>
+          </w:tcPr>
+          <w:p>
+            <w:pPr>
+              <w:spacing w:before="0" w:after="0"/>
+            </w:pPr>
+            <w:r>
+              <w:rPr>
+                <w:sz w:val="20"/>
+              </w:rPr>
+              <w:t>Plan for the rating the platform will require.</w:t>
+            </w:r>
+          </w:p>
+        </w:tc>
+      </w:tr>
+      <w:tr>
+        <w:trPr>
+          <w:cantSplit/>
+        </w:trPr>
+        <w:tc>
+          <w:tcPr>
+            <w:tcW w:type="dxa" w:w="1430"/>
+          </w:tcPr>
+          <w:p>
+            <w:pPr>
+              <w:spacing w:before="0" w:after="0"/>
+            </w:pPr>
+            <w:r>
+              <w:rPr>
+                <w:sz w:val="20"/>
+              </w:rPr>
+              <w:t>Transfer</w:t>
+            </w:r>
+          </w:p>
+        </w:tc>
+        <w:tc>
+          <w:tcPr>
+            <w:tcW w:type="dxa" w:w="5184"/>
+          </w:tcPr>
+          <w:p>
+            <w:pPr>
+              <w:spacing w:before="0" w:after="0"/>
+            </w:pPr>
+            <w:r>
+              <w:rPr>
+                <w:sz w:val="20"/>
+              </w:rPr>
+              <w:t>XR training was about as effective as non-simulated training in a meta-analysis (Kaplan et al. 2021).</w:t>
+            </w:r>
+          </w:p>
+        </w:tc>
+        <w:tc>
+          <w:tcPr>
+            <w:tcW w:type="dxa" w:w="3024"/>
+          </w:tcPr>
+          <w:p>
+            <w:pPr>
+              <w:spacing w:before="0" w:after="0"/>
+            </w:pPr>
+            <w:r>
+              <w:rPr>
+                <w:sz w:val="20"/>
+              </w:rPr>
+              <w:t>Test in the real place and moment: the lab result is not the transfer.</w:t>
+            </w:r>
+          </w:p>
+        </w:tc>
+      </w:tr>
+      <w:tr>
+        <w:trPr>
+          <w:cantSplit/>
+        </w:trPr>
+        <w:tc>
+          <w:tcPr>
+            <w:tcW w:type="dxa" w:w="1430"/>
+          </w:tcPr>
+          <w:p>
+            <w:pPr>
+              <w:spacing w:before="0" w:after="0"/>
+            </w:pPr>
+            <w:r>
+              <w:rPr>
+                <w:sz w:val="20"/>
+              </w:rPr>
+              <w:t>Data</w:t>
+            </w:r>
+          </w:p>
+        </w:tc>
+        <w:tc>
+          <w:tcPr>
+            <w:tcW w:type="dxa" w:w="5184"/>
+          </w:tcPr>
+          <w:p>
+            <w:pPr>
+              <w:spacing w:before="0" w:after="0"/>
+            </w:pPr>
+            <w:r>
+              <w:rPr>
+                <w:sz w:val="20"/>
+              </w:rPr>
+              <w:t>Motion tracking data identified people with above 95% accuracy in a study of over 500 participants (Miller et al. 2020, as reported).</w:t>
+            </w:r>
+          </w:p>
+        </w:tc>
+        <w:tc>
+          <w:tcPr>
+            <w:tcW w:type="dxa" w:w="3024"/>
+          </w:tcPr>
+          <w:p>
+            <w:pPr>
+              <w:spacing w:before="0" w:after="0"/>
+            </w:pPr>
+            <w:r>
+              <w:rPr>
+                <w:sz w:val="20"/>
+              </w:rPr>
+              <w:t>Decide what a test records, and for how long it is kept.</w:t>
+            </w:r>
+          </w:p>
+        </w:tc>
+      </w:tr>
+    </w:tbl>
+    <w:p>
+      <w:pPr>
+        <w:spacing w:before="0" w:after="80"/>
+      </w:pPr>
+    </w:p>
     <w:tbl>
       <w:tblPr>
         <w:tblW w:w="9598" w:type="dxa"/>
@@ -3771,7 +4450,7 @@
             </w:pPr>
             <w:r>
               <w:rPr/>
-              <w:t>Fernwood, Leila, Sam, Rafael and Greta are made up for this example; the corridor and the reports are drawn for the lesson. Asking about presence follows Witmer and Singer (1998); asking about simulator sickness follows Kennedy et al. (1993); rating comfort on one scale before release follows Meta's store policies.</w:t>
+              <w:t>Fernwood, Leila, Sam, Rafael and Greta are made up for this example; the corridor and the reports are drawn for the lesson. Asking about presence follows Witmer and Singer (1998); asking about simulator sickness follows Kennedy et al. (1993); rating comfort on one scale before release follows Meta's store policies. The findings in the table of real evidence are real research results, rules and cases; the sources are listed below.</w:t>
             </w:r>
           </w:p>
         </w:tc>
@@ -3960,7 +4639,7 @@
           <w:color w:val="556274"/>
           <w:sz w:val="18"/>
         </w:rPr>
-        <w:t>Witmer &amp; Singer 1998 · Kennedy et al. 1993 · Meta Horizon Store policies</w:t>
+        <w:t>Witmer &amp; Singer 1998 · Kennedy et al. 1993 · Meta Horizon Store policies · Kaplan et al. 2021 · Miller et al. 2020</w:t>
       </w:r>
     </w:p>
     <w:p>
@@ -4195,6 +4874,319 @@
         <w:t>Figure 5 · Seven ethical questions asked of three Fernwood ideas.</w:t>
       </w:r>
     </w:p>
+    <w:p>
+      <w:pPr>
+        <w:spacing w:before="0" w:after="100"/>
+      </w:pPr>
+      <w:r>
+        <w:rPr>
+          <w:b/>
+        </w:rPr>
+        <w:t>Feasible or responsible: a framework and the rules</w:t>
+      </w:r>
+    </w:p>
+    <w:tbl>
+      <w:tblPr>
+        <w:tblW w:w="9638" w:type="dxa"/>
+        <w:tblBorders>
+          <w:top w:val="single" w:sz="4" w:space="0" w:color="D5DEE9"/>
+          <w:left w:val="single" w:sz="4" w:space="0" w:color="D5DEE9"/>
+          <w:bottom w:val="single" w:sz="4" w:space="0" w:color="D5DEE9"/>
+          <w:right w:val="single" w:sz="4" w:space="0" w:color="D5DEE9"/>
+          <w:insideH w:val="single" w:sz="4" w:space="0" w:color="D5DEE9"/>
+          <w:insideV w:val="single" w:sz="4" w:space="0" w:color="D5DEE9"/>
+        </w:tblBorders>
+        <w:tblLayout w:type="fixed"/>
+        <w:tblCellMar>
+          <w:top w:w="60" w:type="dxa"/>
+          <w:left w:w="100" w:type="dxa"/>
+          <w:bottom w:w="60" w:type="dxa"/>
+          <w:right w:w="100" w:type="dxa"/>
+        </w:tblCellMar>
+      </w:tblPr>
+      <w:tblGrid>
+        <w:gridCol w:w="1895"/>
+        <w:gridCol w:w="4602"/>
+        <w:gridCol w:w="3141"/>
+      </w:tblGrid>
+      <w:tr>
+        <w:trPr>
+          <w:cantSplit/>
+          <w:tblHeader/>
+        </w:trPr>
+        <w:tc>
+          <w:tcPr>
+            <w:tcW w:type="dxa" w:w="1895"/>
+            <w:shd w:val="clear" w:color="auto" w:fill="E6ECF4"/>
+          </w:tcPr>
+          <w:p>
+            <w:pPr>
+              <w:spacing w:before="0" w:after="0"/>
+            </w:pPr>
+            <w:r>
+              <w:rPr>
+                <w:b/>
+                <w:sz w:val="20"/>
+              </w:rPr>
+              <w:t>Source</w:t>
+            </w:r>
+          </w:p>
+        </w:tc>
+        <w:tc>
+          <w:tcPr>
+            <w:tcW w:type="dxa" w:w="4602"/>
+            <w:shd w:val="clear" w:color="auto" w:fill="E6ECF4"/>
+          </w:tcPr>
+          <w:p>
+            <w:pPr>
+              <w:spacing w:before="0" w:after="0"/>
+            </w:pPr>
+            <w:r>
+              <w:rPr>
+                <w:b/>
+                <w:sz w:val="20"/>
+              </w:rPr>
+              <w:t>Real framework or rule</w:t>
+            </w:r>
+          </w:p>
+        </w:tc>
+        <w:tc>
+          <w:tcPr>
+            <w:tcW w:type="dxa" w:w="3141"/>
+            <w:shd w:val="clear" w:color="auto" w:fill="E6ECF4"/>
+          </w:tcPr>
+          <w:p>
+            <w:pPr>
+              <w:spacing w:before="0" w:after="0"/>
+            </w:pPr>
+            <w:r>
+              <w:rPr>
+                <w:b/>
+                <w:sz w:val="20"/>
+              </w:rPr>
+              <w:t>What it means for a strategy</w:t>
+            </w:r>
+          </w:p>
+        </w:tc>
+      </w:tr>
+      <w:tr>
+        <w:trPr>
+          <w:cantSplit/>
+        </w:trPr>
+        <w:tc>
+          <w:tcPr>
+            <w:tcW w:type="dxa" w:w="1895"/>
+          </w:tcPr>
+          <w:p>
+            <w:pPr>
+              <w:spacing w:before="0" w:after="0"/>
+            </w:pPr>
+            <w:r>
+              <w:rPr>
+                <w:sz w:val="20"/>
+              </w:rPr>
+              <w:t>Responsible innovation</w:t>
+            </w:r>
+          </w:p>
+        </w:tc>
+        <w:tc>
+          <w:tcPr>
+            <w:tcW w:type="dxa" w:w="4602"/>
+          </w:tcPr>
+          <w:p>
+            <w:pPr>
+              <w:spacing w:before="0" w:after="0"/>
+            </w:pPr>
+            <w:r>
+              <w:rPr>
+                <w:sz w:val="20"/>
+              </w:rPr>
+              <w:t>Stilgoe, Owen and Macnaghten name four dimensions: anticipation, reflexivity, inclusion and responsiveness (Stilgoe et al. 2013).</w:t>
+            </w:r>
+          </w:p>
+        </w:tc>
+        <w:tc>
+          <w:tcPr>
+            <w:tcW w:type="dxa" w:w="3141"/>
+          </w:tcPr>
+          <w:p>
+            <w:pPr>
+              <w:spacing w:before="0" w:after="0"/>
+            </w:pPr>
+            <w:r>
+              <w:rPr>
+                <w:sz w:val="20"/>
+              </w:rPr>
+              <w:t>Ask the four questions at every gate: what could follow, what are we assuming, who is missing, what will we change?</w:t>
+            </w:r>
+          </w:p>
+        </w:tc>
+      </w:tr>
+      <w:tr>
+        <w:trPr>
+          <w:cantSplit/>
+        </w:trPr>
+        <w:tc>
+          <w:tcPr>
+            <w:tcW w:type="dxa" w:w="1895"/>
+          </w:tcPr>
+          <w:p>
+            <w:pPr>
+              <w:spacing w:before="0" w:after="0"/>
+            </w:pPr>
+            <w:r>
+              <w:rPr>
+                <w:sz w:val="20"/>
+              </w:rPr>
+              <w:t>Banned practice</w:t>
+            </w:r>
+          </w:p>
+        </w:tc>
+        <w:tc>
+          <w:tcPr>
+            <w:tcW w:type="dxa" w:w="4602"/>
+          </w:tcPr>
+          <w:p>
+            <w:pPr>
+              <w:spacing w:before="0" w:after="0"/>
+            </w:pPr>
+            <w:r>
+              <w:rPr>
+                <w:sz w:val="20"/>
+              </w:rPr>
+              <w:t>The EU AI Act prohibits emotion recognition in workplaces and educational institutions, with exceptions for medical and safety reasons (Article 5(1)(f)).</w:t>
+            </w:r>
+          </w:p>
+        </w:tc>
+        <w:tc>
+          <w:tcPr>
+            <w:tcW w:type="dxa" w:w="3141"/>
+          </w:tcPr>
+          <w:p>
+            <w:pPr>
+              <w:spacing w:before="0" w:after="0"/>
+            </w:pPr>
+            <w:r>
+              <w:rPr>
+                <w:sz w:val="20"/>
+              </w:rPr>
+              <w:t>Some applications are not allowed at all: check before you build.</w:t>
+            </w:r>
+          </w:p>
+        </w:tc>
+      </w:tr>
+      <w:tr>
+        <w:trPr>
+          <w:cantSplit/>
+        </w:trPr>
+        <w:tc>
+          <w:tcPr>
+            <w:tcW w:type="dxa" w:w="1895"/>
+          </w:tcPr>
+          <w:p>
+            <w:pPr>
+              <w:spacing w:before="0" w:after="0"/>
+            </w:pPr>
+            <w:r>
+              <w:rPr>
+                <w:sz w:val="20"/>
+              </w:rPr>
+              <w:t>Transparency</w:t>
+            </w:r>
+          </w:p>
+        </w:tc>
+        <w:tc>
+          <w:tcPr>
+            <w:tcW w:type="dxa" w:w="4602"/>
+          </w:tcPr>
+          <w:p>
+            <w:pPr>
+              <w:spacing w:before="0" w:after="0"/>
+            </w:pPr>
+            <w:r>
+              <w:rPr>
+                <w:sz w:val="20"/>
+              </w:rPr>
+              <w:t>People have to be told that they are interacting with an AI system, unless that is obvious (EU AI Act, Article 50).</w:t>
+            </w:r>
+          </w:p>
+        </w:tc>
+        <w:tc>
+          <w:tcPr>
+            <w:tcW w:type="dxa" w:w="3141"/>
+          </w:tcPr>
+          <w:p>
+            <w:pPr>
+              <w:spacing w:before="0" w:after="0"/>
+            </w:pPr>
+            <w:r>
+              <w:rPr>
+                <w:sz w:val="20"/>
+              </w:rPr>
+              <w:t>Label AI in immersive scenes, including AI characters.</w:t>
+            </w:r>
+          </w:p>
+        </w:tc>
+      </w:tr>
+      <w:tr>
+        <w:trPr>
+          <w:cantSplit/>
+        </w:trPr>
+        <w:tc>
+          <w:tcPr>
+            <w:tcW w:type="dxa" w:w="1895"/>
+          </w:tcPr>
+          <w:p>
+            <w:pPr>
+              <w:spacing w:before="0" w:after="0"/>
+            </w:pPr>
+            <w:r>
+              <w:rPr>
+                <w:sz w:val="20"/>
+              </w:rPr>
+              <w:t>Social acceptance</w:t>
+            </w:r>
+          </w:p>
+        </w:tc>
+        <w:tc>
+          <w:tcPr>
+            <w:tcW w:type="dxa" w:w="4602"/>
+          </w:tcPr>
+          <w:p>
+            <w:pPr>
+              <w:spacing w:before="0" w:after="0"/>
+            </w:pPr>
+            <w:r>
+              <w:rPr>
+                <w:sz w:val="20"/>
+              </w:rPr>
+              <w:t>Glass met a public backlash, with signs in businesses and the name “Glassholes”, in the account of press reports (as reported).</w:t>
+            </w:r>
+          </w:p>
+        </w:tc>
+        <w:tc>
+          <w:tcPr>
+            <w:tcW w:type="dxa" w:w="3141"/>
+          </w:tcPr>
+          <w:p>
+            <w:pPr>
+              <w:spacing w:before="0" w:after="0"/>
+            </w:pPr>
+            <w:r>
+              <w:rPr>
+                <w:sz w:val="20"/>
+              </w:rPr>
+              <w:t>Include the people around the user in the inclusion question.</w:t>
+            </w:r>
+          </w:p>
+        </w:tc>
+      </w:tr>
+    </w:tbl>
+    <w:p>
+      <w:pPr>
+        <w:spacing w:before="0" w:after="80"/>
+      </w:pPr>
+    </w:p>
     <w:tbl>
       <w:tblPr>
         <w:tblW w:w="9598" w:type="dxa"/>
@@ -4244,7 +5236,7 @@
             </w:pPr>
             <w:r>
               <w:rPr/>
-              <w:t>Fernwood, Leila, Sam, Rafael and Greta are made up for this example; the corridor and the reports are drawn for the lesson. Anticipation, reflection, inclusion and responsiveness follow Stilgoe, Owen and Macnaghten (2013); the EU bans emotion recognition at work and in education and harmful manipulation (European Commission, AI Act).</w:t>
+              <w:t>Fernwood, Leila, Sam, Rafael and Greta are made up for this example; the corridor and the reports are drawn for the lesson. Anticipation, reflection, inclusion and responsiveness follow Stilgoe, Owen and Macnaghten (2013); the EU bans emotion recognition at work and in education and harmful manipulation (European Commission, AI Act). The findings in the table of real evidence are real research results, rules and cases; the sources are listed below.</w:t>
             </w:r>
           </w:p>
         </w:tc>
@@ -4668,6 +5660,266 @@
         <w:t>Figure 7 · How a steerable future architecture grows out of experiments, pilots and research.</w:t>
       </w:r>
     </w:p>
+    <w:p>
+      <w:pPr>
+        <w:spacing w:before="0" w:after="100"/>
+      </w:pPr>
+      <w:r>
+        <w:rPr>
+          <w:b/>
+        </w:rPr>
+        <w:t>Maturity, learning and the portfolio: real practice</w:t>
+      </w:r>
+    </w:p>
+    <w:tbl>
+      <w:tblPr>
+        <w:tblW w:w="9638" w:type="dxa"/>
+        <w:tblBorders>
+          <w:top w:val="single" w:sz="4" w:space="0" w:color="D5DEE9"/>
+          <w:left w:val="single" w:sz="4" w:space="0" w:color="D5DEE9"/>
+          <w:bottom w:val="single" w:sz="4" w:space="0" w:color="D5DEE9"/>
+          <w:right w:val="single" w:sz="4" w:space="0" w:color="D5DEE9"/>
+          <w:insideH w:val="single" w:sz="4" w:space="0" w:color="D5DEE9"/>
+          <w:insideV w:val="single" w:sz="4" w:space="0" w:color="D5DEE9"/>
+        </w:tblBorders>
+        <w:tblLayout w:type="fixed"/>
+        <w:tblCellMar>
+          <w:top w:w="60" w:type="dxa"/>
+          <w:left w:w="100" w:type="dxa"/>
+          <w:bottom w:w="60" w:type="dxa"/>
+          <w:right w:w="100" w:type="dxa"/>
+        </w:tblCellMar>
+      </w:tblPr>
+      <w:tblGrid>
+        <w:gridCol w:w="1730"/>
+        <w:gridCol w:w="4705"/>
+        <w:gridCol w:w="3203"/>
+      </w:tblGrid>
+      <w:tr>
+        <w:trPr>
+          <w:cantSplit/>
+          <w:tblHeader/>
+        </w:trPr>
+        <w:tc>
+          <w:tcPr>
+            <w:tcW w:type="dxa" w:w="1730"/>
+            <w:shd w:val="clear" w:color="auto" w:fill="E6ECF4"/>
+          </w:tcPr>
+          <w:p>
+            <w:pPr>
+              <w:spacing w:before="0" w:after="0"/>
+            </w:pPr>
+            <w:r>
+              <w:rPr>
+                <w:b/>
+                <w:sz w:val="20"/>
+              </w:rPr>
+              <w:t>Idea</w:t>
+            </w:r>
+          </w:p>
+        </w:tc>
+        <w:tc>
+          <w:tcPr>
+            <w:tcW w:type="dxa" w:w="4705"/>
+            <w:shd w:val="clear" w:color="auto" w:fill="E6ECF4"/>
+          </w:tcPr>
+          <w:p>
+            <w:pPr>
+              <w:spacing w:before="0" w:after="0"/>
+            </w:pPr>
+            <w:r>
+              <w:rPr>
+                <w:b/>
+                <w:sz w:val="20"/>
+              </w:rPr>
+              <w:t>Real source</w:t>
+            </w:r>
+          </w:p>
+        </w:tc>
+        <w:tc>
+          <w:tcPr>
+            <w:tcW w:type="dxa" w:w="3203"/>
+            <w:shd w:val="clear" w:color="auto" w:fill="E6ECF4"/>
+          </w:tcPr>
+          <w:p>
+            <w:pPr>
+              <w:spacing w:before="0" w:after="0"/>
+            </w:pPr>
+            <w:r>
+              <w:rPr>
+                <w:b/>
+                <w:sz w:val="20"/>
+              </w:rPr>
+              <w:t>What it means for a portfolio</w:t>
+            </w:r>
+          </w:p>
+        </w:tc>
+      </w:tr>
+      <w:tr>
+        <w:trPr>
+          <w:cantSplit/>
+        </w:trPr>
+        <w:tc>
+          <w:tcPr>
+            <w:tcW w:type="dxa" w:w="1730"/>
+          </w:tcPr>
+          <w:p>
+            <w:pPr>
+              <w:spacing w:before="0" w:after="0"/>
+            </w:pPr>
+            <w:r>
+              <w:rPr>
+                <w:sz w:val="20"/>
+              </w:rPr>
+              <w:t>Stages and gates</w:t>
+            </w:r>
+          </w:p>
+        </w:tc>
+        <w:tc>
+          <w:tcPr>
+            <w:tcW w:type="dxa" w:w="4705"/>
+          </w:tcPr>
+          <w:p>
+            <w:pPr>
+              <w:spacing w:before="0" w:after="0"/>
+            </w:pPr>
+            <w:r>
+              <w:rPr>
+                <w:sz w:val="20"/>
+              </w:rPr>
+              <w:t>Cooper's stage-gate system manages new products through stages with gates (Cooper 1990).</w:t>
+            </w:r>
+          </w:p>
+        </w:tc>
+        <w:tc>
+          <w:tcPr>
+            <w:tcW w:type="dxa" w:w="3203"/>
+          </w:tcPr>
+          <w:p>
+            <w:pPr>
+              <w:spacing w:before="0" w:after="0"/>
+            </w:pPr>
+            <w:r>
+              <w:rPr>
+                <w:sz w:val="20"/>
+              </w:rPr>
+              <w:t>Run every immersive line through the same gates, so lines can be compared.</w:t>
+            </w:r>
+          </w:p>
+        </w:tc>
+      </w:tr>
+      <w:tr>
+        <w:trPr>
+          <w:cantSplit/>
+        </w:trPr>
+        <w:tc>
+          <w:tcPr>
+            <w:tcW w:type="dxa" w:w="1730"/>
+          </w:tcPr>
+          <w:p>
+            <w:pPr>
+              <w:spacing w:before="0" w:after="0"/>
+            </w:pPr>
+            <w:r>
+              <w:rPr>
+                <w:sz w:val="20"/>
+              </w:rPr>
+              <w:t>Learning</w:t>
+            </w:r>
+          </w:p>
+        </w:tc>
+        <w:tc>
+          <w:tcPr>
+            <w:tcW w:type="dxa" w:w="4705"/>
+          </w:tcPr>
+          <w:p>
+            <w:pPr>
+              <w:spacing w:before="0" w:after="0"/>
+            </w:pPr>
+            <w:r>
+              <w:rPr>
+                <w:sz w:val="20"/>
+              </w:rPr>
+              <w:t>Organisations learn when they question the assumptions behind their actions, not only the actions (Argyris and Schön 1978).</w:t>
+            </w:r>
+          </w:p>
+        </w:tc>
+        <w:tc>
+          <w:tcPr>
+            <w:tcW w:type="dxa" w:w="3203"/>
+          </w:tcPr>
+          <w:p>
+            <w:pPr>
+              <w:spacing w:before="0" w:after="0"/>
+            </w:pPr>
+            <w:r>
+              <w:rPr>
+                <w:sz w:val="20"/>
+              </w:rPr>
+              <w:t>At each gate ask what the pilot taught about the assumptions, not only about the product.</w:t>
+            </w:r>
+          </w:p>
+        </w:tc>
+      </w:tr>
+      <w:tr>
+        <w:trPr>
+          <w:cantSplit/>
+        </w:trPr>
+        <w:tc>
+          <w:tcPr>
+            <w:tcW w:type="dxa" w:w="1730"/>
+          </w:tcPr>
+          <w:p>
+            <w:pPr>
+              <w:spacing w:before="0" w:after="0"/>
+            </w:pPr>
+            <w:r>
+              <w:rPr>
+                <w:sz w:val="20"/>
+              </w:rPr>
+              <w:t>Phased government practice</w:t>
+            </w:r>
+          </w:p>
+        </w:tc>
+        <w:tc>
+          <w:tcPr>
+            <w:tcW w:type="dxa" w:w="4705"/>
+          </w:tcPr>
+          <w:p>
+            <w:pPr>
+              <w:spacing w:before="0" w:after="0"/>
+            </w:pPr>
+            <w:r>
+              <w:rPr>
+                <w:sz w:val="20"/>
+              </w:rPr>
+              <w:t>UK government services move through discovery, alpha, beta and live, and the Service Standard is applied at each (GOV.UK Service Standard; GOV.UK Service Manual).</w:t>
+            </w:r>
+          </w:p>
+        </w:tc>
+        <w:tc>
+          <w:tcPr>
+            <w:tcW w:type="dxa" w:w="3203"/>
+          </w:tcPr>
+          <w:p>
+            <w:pPr>
+              <w:spacing w:before="0" w:after="0"/>
+            </w:pPr>
+            <w:r>
+              <w:rPr>
+                <w:sz w:val="20"/>
+              </w:rPr>
+              <w:t>Limit the number of lines in each phase.</w:t>
+            </w:r>
+          </w:p>
+        </w:tc>
+      </w:tr>
+    </w:tbl>
+    <w:p>
+      <w:pPr>
+        <w:spacing w:before="0" w:after="80"/>
+      </w:pPr>
+    </w:p>
     <w:tbl>
       <w:tblPr>
         <w:tblW w:w="9598" w:type="dxa"/>
@@ -4717,7 +5969,7 @@
             </w:pPr>
             <w:r>
               <w:rPr/>
-              <w:t>Fernwood, Leila, Sam, Rafael and Greta are made up for this example; the corridor and the reports are drawn for the lesson. Learning by questioning one's own assumptions follows Argyris and Schön (1978); deciding at gates follows Cooper (1990).</w:t>
+              <w:t>Fernwood, Leila, Sam, Rafael and Greta are made up for this example; the corridor and the reports are drawn for the lesson. Learning by questioning one's own assumptions follows Argyris and Schön (1978); deciding at gates follows Cooper (1990). The findings in the table of real evidence are real research results, rules and cases; the sources are listed below.</w:t>
             </w:r>
           </w:p>
         </w:tc>
@@ -4906,7 +6158,7 @@
           <w:color w:val="556274"/>
           <w:sz w:val="18"/>
         </w:rPr>
-        <w:t>Argyris &amp; Schön 1978 · Cooper 1990</w:t>
+        <w:t>Argyris &amp; Schön 1978 · Cooper 1990 · GOV.UK Service Standard · GOV.UK Service Manual</w:t>
       </w:r>
     </w:p>
     <w:p>
@@ -5141,6 +6393,266 @@
         <w:t>Figure 9 · Fernwood weighs three measures on effect on users, feasibility, risk, time pressure and strategic viability.</w:t>
       </w:r>
     </w:p>
+    <w:p>
+      <w:pPr>
+        <w:spacing w:before="0" w:after="100"/>
+      </w:pPr>
+      <w:r>
+        <w:rPr>
+          <w:b/>
+        </w:rPr>
+        <w:t>When not to scale: findings and a case</w:t>
+      </w:r>
+    </w:p>
+    <w:tbl>
+      <w:tblPr>
+        <w:tblW w:w="9638" w:type="dxa"/>
+        <w:tblBorders>
+          <w:top w:val="single" w:sz="4" w:space="0" w:color="D5DEE9"/>
+          <w:left w:val="single" w:sz="4" w:space="0" w:color="D5DEE9"/>
+          <w:bottom w:val="single" w:sz="4" w:space="0" w:color="D5DEE9"/>
+          <w:right w:val="single" w:sz="4" w:space="0" w:color="D5DEE9"/>
+          <w:insideH w:val="single" w:sz="4" w:space="0" w:color="D5DEE9"/>
+          <w:insideV w:val="single" w:sz="4" w:space="0" w:color="D5DEE9"/>
+        </w:tblBorders>
+        <w:tblLayout w:type="fixed"/>
+        <w:tblCellMar>
+          <w:top w:w="60" w:type="dxa"/>
+          <w:left w:w="100" w:type="dxa"/>
+          <w:bottom w:w="60" w:type="dxa"/>
+          <w:right w:w="100" w:type="dxa"/>
+        </w:tblCellMar>
+      </w:tblPr>
+      <w:tblGrid>
+        <w:gridCol w:w="1821"/>
+        <w:gridCol w:w="5090"/>
+        <w:gridCol w:w="2727"/>
+      </w:tblGrid>
+      <w:tr>
+        <w:trPr>
+          <w:cantSplit/>
+          <w:tblHeader/>
+        </w:trPr>
+        <w:tc>
+          <w:tcPr>
+            <w:tcW w:type="dxa" w:w="1821"/>
+            <w:shd w:val="clear" w:color="auto" w:fill="E6ECF4"/>
+          </w:tcPr>
+          <w:p>
+            <w:pPr>
+              <w:spacing w:before="0" w:after="0"/>
+            </w:pPr>
+            <w:r>
+              <w:rPr>
+                <w:b/>
+                <w:sz w:val="20"/>
+              </w:rPr>
+              <w:t>Reason not to scale</w:t>
+            </w:r>
+          </w:p>
+        </w:tc>
+        <w:tc>
+          <w:tcPr>
+            <w:tcW w:type="dxa" w:w="5090"/>
+            <w:shd w:val="clear" w:color="auto" w:fill="E6ECF4"/>
+          </w:tcPr>
+          <w:p>
+            <w:pPr>
+              <w:spacing w:before="0" w:after="0"/>
+            </w:pPr>
+            <w:r>
+              <w:rPr>
+                <w:b/>
+                <w:sz w:val="20"/>
+              </w:rPr>
+              <w:t>Real evidence</w:t>
+            </w:r>
+          </w:p>
+        </w:tc>
+        <w:tc>
+          <w:tcPr>
+            <w:tcW w:type="dxa" w:w="2727"/>
+            <w:shd w:val="clear" w:color="auto" w:fill="E6ECF4"/>
+          </w:tcPr>
+          <w:p>
+            <w:pPr>
+              <w:spacing w:before="0" w:after="0"/>
+            </w:pPr>
+            <w:r>
+              <w:rPr>
+                <w:b/>
+                <w:sz w:val="20"/>
+              </w:rPr>
+              <w:t>What it means for a decision</w:t>
+            </w:r>
+          </w:p>
+        </w:tc>
+      </w:tr>
+      <w:tr>
+        <w:trPr>
+          <w:cantSplit/>
+        </w:trPr>
+        <w:tc>
+          <w:tcPr>
+            <w:tcW w:type="dxa" w:w="1821"/>
+          </w:tcPr>
+          <w:p>
+            <w:pPr>
+              <w:spacing w:before="0" w:after="0"/>
+            </w:pPr>
+            <w:r>
+              <w:rPr>
+                <w:sz w:val="20"/>
+              </w:rPr>
+              <w:t>No advantage over the plain way</w:t>
+            </w:r>
+          </w:p>
+        </w:tc>
+        <w:tc>
+          <w:tcPr>
+            <w:tcW w:type="dxa" w:w="5090"/>
+          </w:tcPr>
+          <w:p>
+            <w:pPr>
+              <w:spacing w:before="0" w:after="0"/>
+            </w:pPr>
+            <w:r>
+              <w:rPr>
+                <w:sz w:val="20"/>
+              </w:rPr>
+              <w:t>Training in extended reality was equally effective as non-simulated training (Kaplan et al. 2021).</w:t>
+            </w:r>
+          </w:p>
+        </w:tc>
+        <w:tc>
+          <w:tcPr>
+            <w:tcW w:type="dxa" w:w="2727"/>
+          </w:tcPr>
+          <w:p>
+            <w:pPr>
+              <w:spacing w:before="0" w:after="0"/>
+            </w:pPr>
+            <w:r>
+              <w:rPr>
+                <w:sz w:val="20"/>
+              </w:rPr>
+              <w:t>If the plain way is as good, the case for scaling is cost, access or safety, not effect.</w:t>
+            </w:r>
+          </w:p>
+        </w:tc>
+      </w:tr>
+      <w:tr>
+        <w:trPr>
+          <w:cantSplit/>
+        </w:trPr>
+        <w:tc>
+          <w:tcPr>
+            <w:tcW w:type="dxa" w:w="1821"/>
+          </w:tcPr>
+          <w:p>
+            <w:pPr>
+              <w:spacing w:before="0" w:after="0"/>
+            </w:pPr>
+            <w:r>
+              <w:rPr>
+                <w:sz w:val="20"/>
+              </w:rPr>
+              <w:t>A harm that grows with scale</w:t>
+            </w:r>
+          </w:p>
+        </w:tc>
+        <w:tc>
+          <w:tcPr>
+            <w:tcW w:type="dxa" w:w="5090"/>
+          </w:tcPr>
+          <w:p>
+            <w:pPr>
+              <w:spacing w:before="0" w:after="0"/>
+            </w:pPr>
+            <w:r>
+              <w:rPr>
+                <w:sz w:val="20"/>
+              </w:rPr>
+              <w:t>Motion tracking data can identify people (Miller et al. 2020, as reported), and sickness symptoms affect a large share of users (Rebenitsch and Owen 2016, as reported).</w:t>
+            </w:r>
+          </w:p>
+        </w:tc>
+        <w:tc>
+          <w:tcPr>
+            <w:tcW w:type="dxa" w:w="2727"/>
+          </w:tcPr>
+          <w:p>
+            <w:pPr>
+              <w:spacing w:before="0" w:after="0"/>
+            </w:pPr>
+            <w:r>
+              <w:rPr>
+                <w:sz w:val="20"/>
+              </w:rPr>
+              <w:t>Ask what would be regretted if it went wrong at scale.</w:t>
+            </w:r>
+          </w:p>
+        </w:tc>
+      </w:tr>
+      <w:tr>
+        <w:trPr>
+          <w:cantSplit/>
+        </w:trPr>
+        <w:tc>
+          <w:tcPr>
+            <w:tcW w:type="dxa" w:w="1821"/>
+          </w:tcPr>
+          <w:p>
+            <w:pPr>
+              <w:spacing w:before="0" w:after="0"/>
+            </w:pPr>
+            <w:r>
+              <w:rPr>
+                <w:sz w:val="20"/>
+              </w:rPr>
+              <w:t>A product can be stopped</w:t>
+            </w:r>
+          </w:p>
+        </w:tc>
+        <w:tc>
+          <w:tcPr>
+            <w:tcW w:type="dxa" w:w="5090"/>
+          </w:tcPr>
+          <w:p>
+            <w:pPr>
+              <w:spacing w:before="0" w:after="0"/>
+            </w:pPr>
+            <w:r>
+              <w:rPr>
+                <w:sz w:val="20"/>
+              </w:rPr>
+              <w:t>Google stopped selling Glass to consumers in January 2015 and the enterprise edition in March 2023 (press reports, as reported); government practice includes the decision to stop (GOV.UK Service Manual).</w:t>
+            </w:r>
+          </w:p>
+        </w:tc>
+        <w:tc>
+          <w:tcPr>
+            <w:tcW w:type="dxa" w:w="2727"/>
+          </w:tcPr>
+          <w:p>
+            <w:pPr>
+              <w:spacing w:before="0" w:after="0"/>
+            </w:pPr>
+            <w:r>
+              <w:rPr>
+                <w:sz w:val="20"/>
+              </w:rPr>
+              <w:t>Name the stop decision as an expected outcome, not as a failure.</w:t>
+            </w:r>
+          </w:p>
+        </w:tc>
+      </w:tr>
+    </w:tbl>
+    <w:p>
+      <w:pPr>
+        <w:spacing w:before="0" w:after="80"/>
+      </w:pPr>
+    </w:p>
     <w:tbl>
       <w:tblPr>
         <w:tblW w:w="9598" w:type="dxa"/>
@@ -5190,7 +6702,7 @@
             </w:pPr>
             <w:r>
               <w:rPr/>
-              <w:t>Fernwood, Leila, Sam, Rafael and Greta are made up for this example; the corridor and the reports are drawn for the lesson. Rating options on the same criteria follows Gibbons (2018); the five criteria are the ones the plan names for the case study.</w:t>
+              <w:t>Fernwood, Leila, Sam, Rafael and Greta are made up for this example; the corridor and the reports are drawn for the lesson. Rating options on the same criteria follows Gibbons (2018); the five criteria are the ones the plan names for the case study. The findings in the table of real evidence are real research results, rules and cases; the sources are listed below.</w:t>
             </w:r>
           </w:p>
         </w:tc>
@@ -5379,7 +6891,7 @@
           <w:color w:val="556274"/>
           <w:sz w:val="18"/>
         </w:rPr>
-        <w:t>Cooper 1990 · Gibbons 2018</w:t>
+        <w:t>Cooper 1990 · Gibbons 2018 · Kaplan et al. 2021 · Miller et al. 2020 · Rebenitsch &amp; Owen 2016 · GOV.UK Service Manual</w:t>
       </w:r>
     </w:p>
     <w:p>
@@ -5746,6 +7258,266 @@
         <w:spacing w:before="0" w:after="80"/>
       </w:pPr>
     </w:p>
+    <w:p>
+      <w:pPr>
+        <w:spacing w:before="0" w:after="100"/>
+      </w:pPr>
+      <w:r>
+        <w:rPr>
+          <w:b/>
+        </w:rPr>
+        <w:t>Future-proof UX as a responsible decision architecture: structures</w:t>
+      </w:r>
+    </w:p>
+    <w:tbl>
+      <w:tblPr>
+        <w:tblW w:w="9638" w:type="dxa"/>
+        <w:tblBorders>
+          <w:top w:val="single" w:sz="4" w:space="0" w:color="D5DEE9"/>
+          <w:left w:val="single" w:sz="4" w:space="0" w:color="D5DEE9"/>
+          <w:bottom w:val="single" w:sz="4" w:space="0" w:color="D5DEE9"/>
+          <w:right w:val="single" w:sz="4" w:space="0" w:color="D5DEE9"/>
+          <w:insideH w:val="single" w:sz="4" w:space="0" w:color="D5DEE9"/>
+          <w:insideV w:val="single" w:sz="4" w:space="0" w:color="D5DEE9"/>
+        </w:tblBorders>
+        <w:tblLayout w:type="fixed"/>
+        <w:tblCellMar>
+          <w:top w:w="60" w:type="dxa"/>
+          <w:left w:w="100" w:type="dxa"/>
+          <w:bottom w:w="60" w:type="dxa"/>
+          <w:right w:w="100" w:type="dxa"/>
+        </w:tblCellMar>
+      </w:tblPr>
+      <w:tblGrid>
+        <w:gridCol w:w="1888"/>
+        <w:gridCol w:w="4220"/>
+        <w:gridCol w:w="3530"/>
+      </w:tblGrid>
+      <w:tr>
+        <w:trPr>
+          <w:cantSplit/>
+          <w:tblHeader/>
+        </w:trPr>
+        <w:tc>
+          <w:tcPr>
+            <w:tcW w:type="dxa" w:w="1888"/>
+            <w:shd w:val="clear" w:color="auto" w:fill="E6ECF4"/>
+          </w:tcPr>
+          <w:p>
+            <w:pPr>
+              <w:spacing w:before="0" w:after="0"/>
+            </w:pPr>
+            <w:r>
+              <w:rPr>
+                <w:b/>
+                <w:sz w:val="20"/>
+              </w:rPr>
+              <w:t>Part</w:t>
+            </w:r>
+          </w:p>
+        </w:tc>
+        <w:tc>
+          <w:tcPr>
+            <w:tcW w:type="dxa" w:w="4220"/>
+            <w:shd w:val="clear" w:color="auto" w:fill="E6ECF4"/>
+          </w:tcPr>
+          <w:p>
+            <w:pPr>
+              <w:spacing w:before="0" w:after="0"/>
+            </w:pPr>
+            <w:r>
+              <w:rPr>
+                <w:b/>
+                <w:sz w:val="20"/>
+              </w:rPr>
+              <w:t>Real source</w:t>
+            </w:r>
+          </w:p>
+        </w:tc>
+        <w:tc>
+          <w:tcPr>
+            <w:tcW w:type="dxa" w:w="3530"/>
+            <w:shd w:val="clear" w:color="auto" w:fill="E6ECF4"/>
+          </w:tcPr>
+          <w:p>
+            <w:pPr>
+              <w:spacing w:before="0" w:after="0"/>
+            </w:pPr>
+            <w:r>
+              <w:rPr>
+                <w:b/>
+                <w:sz w:val="20"/>
+              </w:rPr>
+              <w:t>What it means</w:t>
+            </w:r>
+          </w:p>
+        </w:tc>
+      </w:tr>
+      <w:tr>
+        <w:trPr>
+          <w:cantSplit/>
+        </w:trPr>
+        <w:tc>
+          <w:tcPr>
+            <w:tcW w:type="dxa" w:w="1888"/>
+          </w:tcPr>
+          <w:p>
+            <w:pPr>
+              <w:spacing w:before="0" w:after="0"/>
+            </w:pPr>
+            <w:r>
+              <w:rPr>
+                <w:sz w:val="20"/>
+              </w:rPr>
+              <w:t>Four dimensions</w:t>
+            </w:r>
+          </w:p>
+        </w:tc>
+        <w:tc>
+          <w:tcPr>
+            <w:tcW w:type="dxa" w:w="4220"/>
+          </w:tcPr>
+          <w:p>
+            <w:pPr>
+              <w:spacing w:before="0" w:after="0"/>
+            </w:pPr>
+            <w:r>
+              <w:rPr>
+                <w:sz w:val="20"/>
+              </w:rPr>
+              <w:t>Anticipation, reflexivity, inclusion and responsiveness (Stilgoe et al. 2013).</w:t>
+            </w:r>
+          </w:p>
+        </w:tc>
+        <w:tc>
+          <w:tcPr>
+            <w:tcW w:type="dxa" w:w="3530"/>
+          </w:tcPr>
+          <w:p>
+            <w:pPr>
+              <w:spacing w:before="0" w:after="0"/>
+            </w:pPr>
+            <w:r>
+              <w:rPr>
+                <w:sz w:val="20"/>
+              </w:rPr>
+              <w:t>Build the four questions into the process, not into a slide.</w:t>
+            </w:r>
+          </w:p>
+        </w:tc>
+      </w:tr>
+      <w:tr>
+        <w:trPr>
+          <w:cantSplit/>
+        </w:trPr>
+        <w:tc>
+          <w:tcPr>
+            <w:tcW w:type="dxa" w:w="1888"/>
+          </w:tcPr>
+          <w:p>
+            <w:pPr>
+              <w:spacing w:before="0" w:after="0"/>
+            </w:pPr>
+            <w:r>
+              <w:rPr>
+                <w:sz w:val="20"/>
+              </w:rPr>
+              <w:t>Gates</w:t>
+            </w:r>
+          </w:p>
+        </w:tc>
+        <w:tc>
+          <w:tcPr>
+            <w:tcW w:type="dxa" w:w="4220"/>
+          </w:tcPr>
+          <w:p>
+            <w:pPr>
+              <w:spacing w:before="0" w:after="0"/>
+            </w:pPr>
+            <w:r>
+              <w:rPr>
+                <w:sz w:val="20"/>
+              </w:rPr>
+              <w:t>Stage-gate (Cooper 1990) and the phases of the GOV.UK Service Standard.</w:t>
+            </w:r>
+          </w:p>
+        </w:tc>
+        <w:tc>
+          <w:tcPr>
+            <w:tcW w:type="dxa" w:w="3530"/>
+          </w:tcPr>
+          <w:p>
+            <w:pPr>
+              <w:spacing w:before="0" w:after="0"/>
+            </w:pPr>
+            <w:r>
+              <w:rPr>
+                <w:sz w:val="20"/>
+              </w:rPr>
+              <w:t>Define who decides at each gate and on what.</w:t>
+            </w:r>
+          </w:p>
+        </w:tc>
+      </w:tr>
+      <w:tr>
+        <w:trPr>
+          <w:cantSplit/>
+        </w:trPr>
+        <w:tc>
+          <w:tcPr>
+            <w:tcW w:type="dxa" w:w="1888"/>
+          </w:tcPr>
+          <w:p>
+            <w:pPr>
+              <w:spacing w:before="0" w:after="0"/>
+            </w:pPr>
+            <w:r>
+              <w:rPr>
+                <w:sz w:val="20"/>
+              </w:rPr>
+              <w:t>Law as a design input</w:t>
+            </w:r>
+          </w:p>
+        </w:tc>
+        <w:tc>
+          <w:tcPr>
+            <w:tcW w:type="dxa" w:w="4220"/>
+          </w:tcPr>
+          <w:p>
+            <w:pPr>
+              <w:spacing w:before="0" w:after="0"/>
+            </w:pPr>
+            <w:r>
+              <w:rPr>
+                <w:sz w:val="20"/>
+              </w:rPr>
+              <w:t>EU AI Act, Articles 5 and 50.</w:t>
+            </w:r>
+          </w:p>
+        </w:tc>
+        <w:tc>
+          <w:tcPr>
+            <w:tcW w:type="dxa" w:w="3530"/>
+          </w:tcPr>
+          <w:p>
+            <w:pPr>
+              <w:spacing w:before="0" w:after="0"/>
+            </w:pPr>
+            <w:r>
+              <w:rPr>
+                <w:sz w:val="20"/>
+              </w:rPr>
+              <w:t>Put the legal limits into the brief, not into the final review.</w:t>
+            </w:r>
+          </w:p>
+        </w:tc>
+      </w:tr>
+    </w:tbl>
+    <w:p>
+      <w:pPr>
+        <w:spacing w:before="0" w:after="80"/>
+      </w:pPr>
+    </w:p>
     <w:tbl>
       <w:tblPr>
         <w:tblW w:w="9598" w:type="dxa"/>
@@ -5795,7 +7567,7 @@
             </w:pPr>
             <w:r>
               <w:rPr/>
-              <w:t>Fernwood, Leila, Sam, Rafael and Greta are made up for this example; the corridor and the reports are drawn for the lesson. Responsible innovation follows Stilgoe, Owen and Macnaghten (2013); gates follow Cooper (1990).</w:t>
+              <w:t>Fernwood, Leila, Sam, Rafael and Greta are made up for this example; the corridor and the reports are drawn for the lesson. Responsible innovation follows Stilgoe, Owen and Macnaghten (2013); gates follow Cooper (1990). The findings in the table of real evidence are real research results, rules and cases; the sources are listed below.</w:t>
             </w:r>
           </w:p>
         </w:tc>
@@ -5984,7 +7756,7 @@
           <w:color w:val="556274"/>
           <w:sz w:val="18"/>
         </w:rPr>
-        <w:t>Stilgoe, Owen &amp; Macnaghten 2013 · Cooper 1990</w:t>
+        <w:t>Stilgoe, Owen &amp; Macnaghten 2013 · Cooper 1990 · EU AI Act 2024</w:t>
       </w:r>
     </w:p>
     <w:p>
@@ -6477,6 +8249,319 @@
         <w:spacing w:before="0" w:after="80"/>
       </w:pPr>
     </w:p>
+    <w:p>
+      <w:pPr>
+        <w:spacing w:before="0" w:after="100"/>
+      </w:pPr>
+      <w:r>
+        <w:rPr>
+          <w:b/>
+        </w:rPr>
+        <w:t>Conflicts of future-proof UX, with evidence</w:t>
+      </w:r>
+    </w:p>
+    <w:tbl>
+      <w:tblPr>
+        <w:tblW w:w="9638" w:type="dxa"/>
+        <w:tblBorders>
+          <w:top w:val="single" w:sz="4" w:space="0" w:color="D5DEE9"/>
+          <w:left w:val="single" w:sz="4" w:space="0" w:color="D5DEE9"/>
+          <w:bottom w:val="single" w:sz="4" w:space="0" w:color="D5DEE9"/>
+          <w:right w:val="single" w:sz="4" w:space="0" w:color="D5DEE9"/>
+          <w:insideH w:val="single" w:sz="4" w:space="0" w:color="D5DEE9"/>
+          <w:insideV w:val="single" w:sz="4" w:space="0" w:color="D5DEE9"/>
+        </w:tblBorders>
+        <w:tblLayout w:type="fixed"/>
+        <w:tblCellMar>
+          <w:top w:w="60" w:type="dxa"/>
+          <w:left w:w="100" w:type="dxa"/>
+          <w:bottom w:w="60" w:type="dxa"/>
+          <w:right w:w="100" w:type="dxa"/>
+        </w:tblCellMar>
+      </w:tblPr>
+      <w:tblGrid>
+        <w:gridCol w:w="2250"/>
+        <w:gridCol w:w="4616"/>
+        <w:gridCol w:w="2772"/>
+      </w:tblGrid>
+      <w:tr>
+        <w:trPr>
+          <w:cantSplit/>
+          <w:tblHeader/>
+        </w:trPr>
+        <w:tc>
+          <w:tcPr>
+            <w:tcW w:type="dxa" w:w="2250"/>
+            <w:shd w:val="clear" w:color="auto" w:fill="E6ECF4"/>
+          </w:tcPr>
+          <w:p>
+            <w:pPr>
+              <w:spacing w:before="0" w:after="0"/>
+            </w:pPr>
+            <w:r>
+              <w:rPr>
+                <w:b/>
+                <w:sz w:val="20"/>
+              </w:rPr>
+              <w:t>Conflict</w:t>
+            </w:r>
+          </w:p>
+        </w:tc>
+        <w:tc>
+          <w:tcPr>
+            <w:tcW w:type="dxa" w:w="4616"/>
+            <w:shd w:val="clear" w:color="auto" w:fill="E6ECF4"/>
+          </w:tcPr>
+          <w:p>
+            <w:pPr>
+              <w:spacing w:before="0" w:after="0"/>
+            </w:pPr>
+            <w:r>
+              <w:rPr>
+                <w:b/>
+                <w:sz w:val="20"/>
+              </w:rPr>
+              <w:t>What the evidence says</w:t>
+            </w:r>
+          </w:p>
+        </w:tc>
+        <w:tc>
+          <w:tcPr>
+            <w:tcW w:type="dxa" w:w="2772"/>
+            <w:shd w:val="clear" w:color="auto" w:fill="E6ECF4"/>
+          </w:tcPr>
+          <w:p>
+            <w:pPr>
+              <w:spacing w:before="0" w:after="0"/>
+            </w:pPr>
+            <w:r>
+              <w:rPr>
+                <w:b/>
+                <w:sz w:val="20"/>
+              </w:rPr>
+              <w:t>A way to decide</w:t>
+            </w:r>
+          </w:p>
+        </w:tc>
+      </w:tr>
+      <w:tr>
+        <w:trPr>
+          <w:cantSplit/>
+        </w:trPr>
+        <w:tc>
+          <w:tcPr>
+            <w:tcW w:type="dxa" w:w="2250"/>
+          </w:tcPr>
+          <w:p>
+            <w:pPr>
+              <w:spacing w:before="0" w:after="0"/>
+            </w:pPr>
+            <w:r>
+              <w:rPr>
+                <w:sz w:val="20"/>
+              </w:rPr>
+              <w:t>Innovation pressure against maturity</w:t>
+            </w:r>
+          </w:p>
+        </w:tc>
+        <w:tc>
+          <w:tcPr>
+            <w:tcW w:type="dxa" w:w="4616"/>
+          </w:tcPr>
+          <w:p>
+            <w:pPr>
+              <w:spacing w:before="0" w:after="0"/>
+            </w:pPr>
+            <w:r>
+              <w:rPr>
+                <w:sz w:val="20"/>
+              </w:rPr>
+              <w:t>A consumer product can be withdrawn after a few years (Google Glass, 2013 to 2015, as reported).</w:t>
+            </w:r>
+          </w:p>
+        </w:tc>
+        <w:tc>
+          <w:tcPr>
+            <w:tcW w:type="dxa" w:w="2772"/>
+          </w:tcPr>
+          <w:p>
+            <w:pPr>
+              <w:spacing w:before="0" w:after="0"/>
+            </w:pPr>
+            <w:r>
+              <w:rPr>
+                <w:sz w:val="20"/>
+              </w:rPr>
+              <w:t>Ask which rung it is really on.</w:t>
+            </w:r>
+          </w:p>
+        </w:tc>
+      </w:tr>
+      <w:tr>
+        <w:trPr>
+          <w:cantSplit/>
+        </w:trPr>
+        <w:tc>
+          <w:tcPr>
+            <w:tcW w:type="dxa" w:w="2250"/>
+          </w:tcPr>
+          <w:p>
+            <w:pPr>
+              <w:spacing w:before="0" w:after="0"/>
+            </w:pPr>
+            <w:r>
+              <w:rPr>
+                <w:sz w:val="20"/>
+              </w:rPr>
+              <w:t>Ethics against speed</w:t>
+            </w:r>
+          </w:p>
+        </w:tc>
+        <w:tc>
+          <w:tcPr>
+            <w:tcW w:type="dxa" w:w="4616"/>
+          </w:tcPr>
+          <w:p>
+            <w:pPr>
+              <w:spacing w:before="0" w:after="0"/>
+            </w:pPr>
+            <w:r>
+              <w:rPr>
+                <w:sz w:val="20"/>
+              </w:rPr>
+              <w:t>Some applications are banned outright (EU AI Act, Article 5(1)(f)), and tracking data identifies people (Miller et al. 2020, as reported).</w:t>
+            </w:r>
+          </w:p>
+        </w:tc>
+        <w:tc>
+          <w:tcPr>
+            <w:tcW w:type="dxa" w:w="2772"/>
+          </w:tcPr>
+          <w:p>
+            <w:pPr>
+              <w:spacing w:before="0" w:after="0"/>
+            </w:pPr>
+            <w:r>
+              <w:rPr>
+                <w:sz w:val="20"/>
+              </w:rPr>
+              <w:t>Ask what would be regretted if it went wrong at scale.</w:t>
+            </w:r>
+          </w:p>
+        </w:tc>
+      </w:tr>
+      <w:tr>
+        <w:trPr>
+          <w:cantSplit/>
+        </w:trPr>
+        <w:tc>
+          <w:tcPr>
+            <w:tcW w:type="dxa" w:w="2250"/>
+          </w:tcPr>
+          <w:p>
+            <w:pPr>
+              <w:spacing w:before="0" w:after="0"/>
+            </w:pPr>
+            <w:r>
+              <w:rPr>
+                <w:sz w:val="20"/>
+              </w:rPr>
+              <w:t>Pioneer role against viability</w:t>
+            </w:r>
+          </w:p>
+        </w:tc>
+        <w:tc>
+          <w:tcPr>
+            <w:tcW w:type="dxa" w:w="4616"/>
+          </w:tcPr>
+          <w:p>
+            <w:pPr>
+              <w:spacing w:before="0" w:after="0"/>
+            </w:pPr>
+            <w:r>
+              <w:rPr>
+                <w:sz w:val="20"/>
+              </w:rPr>
+              <w:t>XR training was not more effective than plain training (Kaplan et al. 2021).</w:t>
+            </w:r>
+          </w:p>
+        </w:tc>
+        <w:tc>
+          <w:tcPr>
+            <w:tcW w:type="dxa" w:w="2772"/>
+          </w:tcPr>
+          <w:p>
+            <w:pPr>
+              <w:spacing w:before="0" w:after="0"/>
+            </w:pPr>
+            <w:r>
+              <w:rPr>
+                <w:sz w:val="20"/>
+              </w:rPr>
+              <w:t>Choose the smallest step that keeps you informed.</w:t>
+            </w:r>
+          </w:p>
+        </w:tc>
+      </w:tr>
+      <w:tr>
+        <w:trPr>
+          <w:cantSplit/>
+        </w:trPr>
+        <w:tc>
+          <w:tcPr>
+            <w:tcW w:type="dxa" w:w="2250"/>
+          </w:tcPr>
+          <w:p>
+            <w:pPr>
+              <w:spacing w:before="0" w:after="0"/>
+            </w:pPr>
+            <w:r>
+              <w:rPr>
+                <w:sz w:val="20"/>
+              </w:rPr>
+              <w:t>Short-term signal against the portfolio</w:t>
+            </w:r>
+          </w:p>
+        </w:tc>
+        <w:tc>
+          <w:tcPr>
+            <w:tcW w:type="dxa" w:w="4616"/>
+          </w:tcPr>
+          <w:p>
+            <w:pPr>
+              <w:spacing w:before="0" w:after="0"/>
+            </w:pPr>
+            <w:r>
+              <w:rPr>
+                <w:sz w:val="20"/>
+              </w:rPr>
+              <w:t>An enterprise edition was sold for six years and then stopped (Google Glass, 2017 to 2023, as reported).</w:t>
+            </w:r>
+          </w:p>
+        </w:tc>
+        <w:tc>
+          <w:tcPr>
+            <w:tcW w:type="dxa" w:w="2772"/>
+          </w:tcPr>
+          <w:p>
+            <w:pPr>
+              <w:spacing w:before="0" w:after="0"/>
+            </w:pPr>
+            <w:r>
+              <w:rPr>
+                <w:sz w:val="20"/>
+              </w:rPr>
+              <w:t>Ask whether it will still matter when the technology changes.</w:t>
+            </w:r>
+          </w:p>
+        </w:tc>
+      </w:tr>
+    </w:tbl>
+    <w:p>
+      <w:pPr>
+        <w:spacing w:before="0" w:after="80"/>
+      </w:pPr>
+    </w:p>
     <w:tbl>
       <w:tblPr>
         <w:tblW w:w="9598" w:type="dxa"/>
@@ -6526,7 +8611,7 @@
             </w:pPr>
             <w:r>
               <w:rPr/>
-              <w:t>Fernwood, Leila, Sam, Rafael and Greta are made up for this example; the corridor and the reports are drawn for the lesson. The lines and their trade-offs are a reading of the example, not a rule for every company.</w:t>
+              <w:t>Fernwood, Leila, Sam, Rafael and Greta are made up for this example; the corridor and the reports are drawn for the lesson. The lines and their trade-offs are a reading of the example, not a rule for every company. The findings in the table of real evidence are real research results, rules and cases; the sources are listed below.</w:t>
             </w:r>
           </w:p>
         </w:tc>
@@ -6715,7 +8800,7 @@
           <w:color w:val="556274"/>
           <w:sz w:val="18"/>
         </w:rPr>
-        <w:t>European Commission, AI Act · Stilgoe, Owen &amp; Macnaghten 2013</w:t>
+        <w:t>European Commission, AI Act · Stilgoe, Owen &amp; Macnaghten 2013 · Kaplan et al. 2021 · Miller et al. 2020 · EU AI Act 2024</w:t>
       </w:r>
     </w:p>
     <w:p>
@@ -7208,6 +9293,266 @@
         <w:spacing w:before="0" w:after="80"/>
       </w:pPr>
     </w:p>
+    <w:p>
+      <w:pPr>
+        <w:spacing w:before="0" w:after="100"/>
+      </w:pPr>
+      <w:r>
+        <w:rPr>
+          <w:b/>
+        </w:rPr>
+        <w:t>Who decides to scale, pause or stop: real practice</w:t>
+      </w:r>
+    </w:p>
+    <w:tbl>
+      <w:tblPr>
+        <w:tblW w:w="9638" w:type="dxa"/>
+        <w:tblBorders>
+          <w:top w:val="single" w:sz="4" w:space="0" w:color="D5DEE9"/>
+          <w:left w:val="single" w:sz="4" w:space="0" w:color="D5DEE9"/>
+          <w:bottom w:val="single" w:sz="4" w:space="0" w:color="D5DEE9"/>
+          <w:right w:val="single" w:sz="4" w:space="0" w:color="D5DEE9"/>
+          <w:insideH w:val="single" w:sz="4" w:space="0" w:color="D5DEE9"/>
+          <w:insideV w:val="single" w:sz="4" w:space="0" w:color="D5DEE9"/>
+        </w:tblBorders>
+        <w:tblLayout w:type="fixed"/>
+        <w:tblCellMar>
+          <w:top w:w="60" w:type="dxa"/>
+          <w:left w:w="100" w:type="dxa"/>
+          <w:bottom w:w="60" w:type="dxa"/>
+          <w:right w:w="100" w:type="dxa"/>
+        </w:tblCellMar>
+      </w:tblPr>
+      <w:tblGrid>
+        <w:gridCol w:w="2051"/>
+        <w:gridCol w:w="4023"/>
+        <w:gridCol w:w="3564"/>
+      </w:tblGrid>
+      <w:tr>
+        <w:trPr>
+          <w:cantSplit/>
+          <w:tblHeader/>
+        </w:trPr>
+        <w:tc>
+          <w:tcPr>
+            <w:tcW w:type="dxa" w:w="2051"/>
+            <w:shd w:val="clear" w:color="auto" w:fill="E6ECF4"/>
+          </w:tcPr>
+          <w:p>
+            <w:pPr>
+              <w:spacing w:before="0" w:after="0"/>
+            </w:pPr>
+            <w:r>
+              <w:rPr>
+                <w:b/>
+                <w:sz w:val="20"/>
+              </w:rPr>
+              <w:t>Responsibility</w:t>
+            </w:r>
+          </w:p>
+        </w:tc>
+        <w:tc>
+          <w:tcPr>
+            <w:tcW w:type="dxa" w:w="4023"/>
+            <w:shd w:val="clear" w:color="auto" w:fill="E6ECF4"/>
+          </w:tcPr>
+          <w:p>
+            <w:pPr>
+              <w:spacing w:before="0" w:after="0"/>
+            </w:pPr>
+            <w:r>
+              <w:rPr>
+                <w:b/>
+                <w:sz w:val="20"/>
+              </w:rPr>
+              <w:t>Real source</w:t>
+            </w:r>
+          </w:p>
+        </w:tc>
+        <w:tc>
+          <w:tcPr>
+            <w:tcW w:type="dxa" w:w="3564"/>
+            <w:shd w:val="clear" w:color="auto" w:fill="E6ECF4"/>
+          </w:tcPr>
+          <w:p>
+            <w:pPr>
+              <w:spacing w:before="0" w:after="0"/>
+            </w:pPr>
+            <w:r>
+              <w:rPr>
+                <w:b/>
+                <w:sz w:val="20"/>
+              </w:rPr>
+              <w:t>What it means</w:t>
+            </w:r>
+          </w:p>
+        </w:tc>
+      </w:tr>
+      <w:tr>
+        <w:trPr>
+          <w:cantSplit/>
+        </w:trPr>
+        <w:tc>
+          <w:tcPr>
+            <w:tcW w:type="dxa" w:w="2051"/>
+          </w:tcPr>
+          <w:p>
+            <w:pPr>
+              <w:spacing w:before="0" w:after="0"/>
+            </w:pPr>
+            <w:r>
+              <w:rPr>
+                <w:sz w:val="20"/>
+              </w:rPr>
+              <w:t>Evaluation</w:t>
+            </w:r>
+          </w:p>
+        </w:tc>
+        <w:tc>
+          <w:tcPr>
+            <w:tcW w:type="dxa" w:w="4023"/>
+          </w:tcPr>
+          <w:p>
+            <w:pPr>
+              <w:spacing w:before="0" w:after="0"/>
+            </w:pPr>
+            <w:r>
+              <w:rPr>
+                <w:sz w:val="20"/>
+              </w:rPr>
+              <w:t>A common grid for every initiative is what stage-gate systems use (Cooper 1990).</w:t>
+            </w:r>
+          </w:p>
+        </w:tc>
+        <w:tc>
+          <w:tcPr>
+            <w:tcW w:type="dxa" w:w="3564"/>
+          </w:tcPr>
+          <w:p>
+            <w:pPr>
+              <w:spacing w:before="0" w:after="0"/>
+            </w:pPr>
+            <w:r>
+              <w:rPr>
+                <w:sz w:val="20"/>
+              </w:rPr>
+              <w:t>Score every initiative on one grid: value, maturity, effort, scaling, responsibility.</w:t>
+            </w:r>
+          </w:p>
+        </w:tc>
+      </w:tr>
+      <w:tr>
+        <w:trPr>
+          <w:cantSplit/>
+        </w:trPr>
+        <w:tc>
+          <w:tcPr>
+            <w:tcW w:type="dxa" w:w="2051"/>
+          </w:tcPr>
+          <w:p>
+            <w:pPr>
+              <w:spacing w:before="0" w:after="0"/>
+            </w:pPr>
+            <w:r>
+              <w:rPr>
+                <w:sz w:val="20"/>
+              </w:rPr>
+              <w:t>Ethical approval</w:t>
+            </w:r>
+          </w:p>
+        </w:tc>
+        <w:tc>
+          <w:tcPr>
+            <w:tcW w:type="dxa" w:w="4023"/>
+          </w:tcPr>
+          <w:p>
+            <w:pPr>
+              <w:spacing w:before="0" w:after="0"/>
+            </w:pPr>
+            <w:r>
+              <w:rPr>
+                <w:sz w:val="20"/>
+              </w:rPr>
+              <w:t>The four dimensions of responsible innovation include inclusion and responsiveness (Stilgoe et al. 2013).</w:t>
+            </w:r>
+          </w:p>
+        </w:tc>
+        <w:tc>
+          <w:tcPr>
+            <w:tcW w:type="dxa" w:w="3564"/>
+          </w:tcPr>
+          <w:p>
+            <w:pPr>
+              <w:spacing w:before="0" w:after="0"/>
+            </w:pPr>
+            <w:r>
+              <w:rPr>
+                <w:sz w:val="20"/>
+              </w:rPr>
+              <w:t>Put an ethics and data review before every pilot and before scaling.</w:t>
+            </w:r>
+          </w:p>
+        </w:tc>
+      </w:tr>
+      <w:tr>
+        <w:trPr>
+          <w:cantSplit/>
+        </w:trPr>
+        <w:tc>
+          <w:tcPr>
+            <w:tcW w:type="dxa" w:w="2051"/>
+          </w:tcPr>
+          <w:p>
+            <w:pPr>
+              <w:spacing w:before="0" w:after="0"/>
+            </w:pPr>
+            <w:r>
+              <w:rPr>
+                <w:sz w:val="20"/>
+              </w:rPr>
+              <w:t>The decision</w:t>
+            </w:r>
+          </w:p>
+        </w:tc>
+        <w:tc>
+          <w:tcPr>
+            <w:tcW w:type="dxa" w:w="4023"/>
+          </w:tcPr>
+          <w:p>
+            <w:pPr>
+              <w:spacing w:before="0" w:after="0"/>
+            </w:pPr>
+            <w:r>
+              <w:rPr>
+                <w:sz w:val="20"/>
+              </w:rPr>
+              <w:t>Government practice names the decision to stop as one of the possible outcomes (GOV.UK Service Manual).</w:t>
+            </w:r>
+          </w:p>
+        </w:tc>
+        <w:tc>
+          <w:tcPr>
+            <w:tcW w:type="dxa" w:w="3564"/>
+          </w:tcPr>
+          <w:p>
+            <w:pPr>
+              <w:spacing w:before="0" w:after="0"/>
+            </w:pPr>
+            <w:r>
+              <w:rPr>
+                <w:sz w:val="20"/>
+              </w:rPr>
+              <w:t>Give the board the right to scale, test further, pause or stop.</w:t>
+            </w:r>
+          </w:p>
+        </w:tc>
+      </w:tr>
+    </w:tbl>
+    <w:p>
+      <w:pPr>
+        <w:spacing w:before="0" w:after="80"/>
+      </w:pPr>
+    </w:p>
     <w:tbl>
       <w:tblPr>
         <w:tblW w:w="9598" w:type="dxa"/>
@@ -7257,7 +9602,7 @@
             </w:pPr>
             <w:r>
               <w:rPr/>
-              <w:t>Fernwood, Leila, Sam, Rafael and Greta are made up for this example; the corridor and the reports are drawn for the lesson. Monitoring after launch follows the European Commission's summary of the AI Act; deciding with limited information follows Simon (1956); the premortem follows Klein (2007).</w:t>
+              <w:t>Fernwood, Leila, Sam, Rafael and Greta are made up for this example; the corridor and the reports are drawn for the lesson. Monitoring after launch follows the European Commission's summary of the AI Act; deciding with limited information follows Simon (1956); the premortem follows Klein (2007). The findings in the table of real evidence are real research results, rules and cases; the sources are listed below.</w:t>
             </w:r>
           </w:p>
         </w:tc>
@@ -7446,7 +9791,7 @@
           <w:color w:val="556274"/>
           <w:sz w:val="18"/>
         </w:rPr>
-        <w:t>European Commission, AI Act · Simon 1956 · Klein 2007</w:t>
+        <w:t>European Commission, AI Act · Simon 1956 · Klein 2007 · Cooper 1990 · Stilgoe, Owen &amp; Macnaghten 2013 · GOV.UK Service Manual</w:t>
       </w:r>
     </w:p>
     <w:p>
@@ -8131,6 +10476,18 @@
         <w:rPr>
           <w:sz w:val="19"/>
         </w:rPr>
+        <w:t>GOV.UK Service Manual. Service Standard. https://www.gov.uk/service-manual/service-standard (14 points since July 2019, 18 before; point 1 is to understand users and their needs; services are assessed against the standard.)</w:t>
+      </w:r>
+    </w:p>
+    <w:p>
+      <w:pPr>
+        <w:spacing w:before="0" w:after="80"/>
+        <w:ind w:left="283" w:hanging="283"/>
+      </w:pPr>
+      <w:r>
+        <w:rPr>
+          <w:sz w:val="19"/>
+        </w:rPr>
         <w:t>Witmer, B. G., &amp; Singer, M. J. (1998). Measuring presence in virtual environments: A presence questionnaire. Presence: Teleoperators and Virtual Environments, 7(3), 225–240. (Presence can be asked about in a structured way after a session.)</w:t>
       </w:r>
     </w:p>
@@ -8156,6 +10513,30 @@
           <w:sz w:val="19"/>
         </w:rPr>
         <w:t>Meta Platforms Technologies. App policies, Meta Horizon Store. https://developers.meta.com/horizon/policy/store-policies/ (read 29.10.2026). (Comfort ratings on one scale, a minimum of utility, content ratings and warnings before release.)</w:t>
+      </w:r>
+    </w:p>
+    <w:p>
+      <w:pPr>
+        <w:spacing w:before="0" w:after="80"/>
+        <w:ind w:left="283" w:hanging="283"/>
+      </w:pPr>
+      <w:r>
+        <w:rPr>
+          <w:sz w:val="19"/>
+        </w:rPr>
+        <w:t>Kaplan, A. D., Cruit, J., Endsley, M., Beers, S. M., Sawyer, B. D., &amp; Hancock, P. A. (2021). The effects of virtual reality, augmented reality, and mixed reality as training enhancement methods: A meta-analysis. Human Factors, 63(4), 706–726. https://doi.org/10.1177/0018720820904229 (Training in virtual, augmented or mixed reality was about as effective as training in a non-simulated environment, not more.)</w:t>
+      </w:r>
+    </w:p>
+    <w:p>
+      <w:pPr>
+        <w:spacing w:before="0" w:after="80"/>
+        <w:ind w:left="283" w:hanging="283"/>
+      </w:pPr>
+      <w:r>
+        <w:rPr>
+          <w:sz w:val="19"/>
+        </w:rPr>
+        <w:t>Miller, M. R., Herrera, F., Jun, H., Landay, J. A., &amp; Bailenson, J. N. (2020). Personal identifiability of user tracking data during observation of 360-degree VR video. Scientific Reports, 10, 17404. https://doi.org/10.1038/s41598-020-74486-y (More than 500 participants could be identified with above 95% accuracy from less than five minutes of tracking data; figures from summaries.)</w:t>
       </w:r>
     </w:p>
     <w:p>
@@ -8215,7 +10596,31 @@
         <w:rPr>
           <w:sz w:val="19"/>
         </w:rPr>
+        <w:t>Government Digital Service. Service Manual: How the discovery phase works; How the alpha phase works. https://www.gov.uk/service-manual/agile-delivery (read 29.10.2026). (Define the problem, test the riskiest assumptions with throwaway prototypes, decide with evidence, including to stop.)</w:t>
+      </w:r>
+    </w:p>
+    <w:p>
+      <w:pPr>
+        <w:spacing w:before="0" w:after="80"/>
+        <w:ind w:left="283" w:hanging="283"/>
+      </w:pPr>
+      <w:r>
+        <w:rPr>
+          <w:sz w:val="19"/>
+        </w:rPr>
         <w:t>Gibbons, S. (2018). Using Prioritization Matrices to Inform UX Decisions. Nielsen Norman Group. https://www.nngroup.com/articles/prioritization-matrices/ (Rate each option on the same few criteria, such as value to the user against effort, and put the reason next to each rating.)</w:t>
+      </w:r>
+    </w:p>
+    <w:p>
+      <w:pPr>
+        <w:spacing w:before="0" w:after="80"/>
+        <w:ind w:left="283" w:hanging="283"/>
+      </w:pPr>
+      <w:r>
+        <w:rPr>
+          <w:sz w:val="19"/>
+        </w:rPr>
+        <w:t>Rebenitsch, L., &amp; Owen, C. (2016). Review on cybersickness in applications and visual displays. Virtual Reality, 20(2), 101–125. (Motion sickness in VR and the factors that make it worse.)</w:t>
       </w:r>
     </w:p>
     <w:p>

</xml_diff>